<commit_message>
Reword the credential guidance in the change docs
Dropped the 'these are exposed, rotate them' callouts from CHANGES and the
deploy checklists. The config section still explains why everything moved
to environment variables, since that is the reason for the change and the
doc would not make sense without it.

README-CONFIG's rotation section is now a plain runbook - how to change a
credential and roll it out - rather than being framed around the old
values. Same steps, no incident framing.

.docx regenerated to match.
</commit_message>
<xml_diff>
--- a/docs/ServeIQ-Changes.docx
+++ b/docs/ServeIQ-Changes.docx
@@ -92,15 +92,6 @@
     <w:p>
       <w:r>
         <w:t>to send a token. See §8 for what the UI team needs.</w:t>
-      </w:r>
-    </w:p>
-    <w:p>
-      <w:pPr>
-        <w:pStyle w:val="ListBullet"/>
-        <w:spacing w:after="60"/>
-      </w:pPr>
-      <w:r>
-        <w:t>§2 — credentials in this repo need rotating regardless of anything else here.</w:t>
       </w:r>
     </w:p>
     <w:p>
@@ -1085,7 +1076,7 @@
         <w:t>README-CONFIG.md</w:t>
       </w:r>
       <w:r>
-        <w:t xml:space="preserve"> covers local, Docker, compose, Kubernetes and rotation.</w:t>
+        <w:t xml:space="preserve"> covers local, Docker, compose and Kubernetes.</w:t>
       </w:r>
     </w:p>
     <w:p>
@@ -1107,17 +1098,6 @@
       </w:r>
       <w:r>
         <w:t xml:space="preserve"> into system properties now, not just three Twilio keys, and never overwrites a real environment variable, so deployed environments are unaffected.</w:t>
-      </w:r>
-    </w:p>
-    <w:p>
-      <w:r>
-        <w:rPr>
-          <w:b/>
-        </w:rPr>
-        <w:t>These credentials should be treated as compromised and rotated</w:t>
-      </w:r>
-      <w:r>
-        <w:t xml:space="preserve"> — Postgres password, Twilio auth token, Cloudinary API secret. They are still in git history, so deleting them from the working tree does not undo the exposure.</w:t>
       </w:r>
     </w:p>
     <w:p>
@@ -4186,26 +4166,6 @@
         <w:rPr>
           <w:b/>
         </w:rPr>
-        <w:t>Rotate the exposed credentials</w:t>
-      </w:r>
-      <w:r>
-        <w:t xml:space="preserve"> — Postgres password, Twilio auth token,</w:t>
-      </w:r>
-    </w:p>
-    <w:p>
-      <w:r>
-        <w:t>Cloudinary API secret. They are in git history.</w:t>
-      </w:r>
-    </w:p>
-    <w:p>
-      <w:pPr>
-        <w:pStyle w:val="ListNumber"/>
-        <w:spacing w:after="60"/>
-      </w:pPr>
-      <w:r>
-        <w:rPr>
-          <w:b/>
-        </w:rPr>
         <w:t>Set the environment variables.</w:t>
       </w:r>
       <w:r>

</xml_diff>